<commit_message>
Allow two weeks for website production across public terms and document templates
</commit_message>
<xml_diff>
--- a/business/website-production-contract.docx
+++ b/business/website-production-contract.docx
@@ -447,7 +447,7 @@
     </w:p>
     <w:p>
       <w:r>
-        <w:t>制作範囲の確定、必要素材の受領、着手金の入金確認が揃った日を制作開始日とします。制作期間は開始から1週間（7日間）を目安とし、実際の最終確認案提出日・公開予定日を別紙1で合意します。目安だけを確定納期として扱いません。</w:t>
+        <w:t>制作範囲の確定、必要素材の受領、着手金の入金確認が揃った日を制作開始日とします。制作期間は開始から2週間（14日間）を目安とし、実際の最終確認案提出日・公開予定日を別紙1で合意します。目安だけを確定納期として扱いません。</w:t>
       </w:r>
     </w:p>
     <w:p>
@@ -1915,7 +1915,7 @@
               <w:rPr>
                 <w:sz w:val="18"/>
               </w:rPr>
-              <w:t>［年・月・日］／［年・月・日］。開始から7日間目安、個別の確定日を記入。</w:t>
+              <w:t>［年・月・日］／［年・月・日］。開始から14日間目安、個別の確定日を記入。</w:t>
             </w:r>
           </w:p>
         </w:tc>
@@ -2204,7 +2204,7 @@
       <w:jc w:val="right"/>
     </w:pPr>
     <w:r>
-      <w:t xml:space="preserve">ひな形 2026-10-05  |  </w:t>
+      <w:t xml:space="preserve">ひな形 2026-10-07  |  </w:t>
     </w:r>
     <w:fldSimple w:instr="PAGE"/>
   </w:p>

</xml_diff>